<commit_message>
Fase 1 v6: sin anexos, sin el primer párrafo de «Sobre esta versión» y sin el aviso a FONASA
- A pedido del autor se quitan los anexos A y B, el primer párrafo del cuadro
  inicial y todo lo relacionado con informar a FONASA de los valores con forma
  de RUT (la decisión 11 queda como «¿Qué se hace con los valores con forma de
  RUT?»). El contenido de los anexos queda en el historial de git (6321de3).
- Fase 2 v6, guía, docs/README.md y VERSIONES_Y_DESVIACIONES.md ya no remiten a
  los anexos ni al aviso a FONASA de la decisión 11.

Co-Authored-By: Claude Opus 5.5 <noreply@anthropic.com>
Claude-Session: https://claude.ai/code/session_0192aVCC8aocJbeAsVJ1Mter
</commit_message>
<xml_diff>
--- a/docs/fase2_comprension_datos/Informe_Fase2_v6.docx
+++ b/docs/fase2_comprension_datos/Informe_Fase2_v6.docx
@@ -6423,7 +6423,7 @@
         <w:t xml:space="preserve">Cartas a FONASA descartadas</w:t>
       </w:r>
       <w:r>
-        <w:t xml:space="preserve"> (versión 4): los 22 valores con forma de RUT se aíslan y no se usan, y las condiciones de publicación se asumen académicas y agregadas. El profesor guía recomienda enviarlas por la vía formal (revisión del 24-10-2026): la decisión está pendiente.</w:t>
+        <w:t xml:space="preserve"> (versión 4): los 22 valores con forma de RUT se aíslan y no se usan, y las condiciones de publicación se asumen académicas y agregadas.</w:t>
       </w:r>
     </w:p>
     <w:p>
@@ -6929,7 +6929,7 @@
         <w:spacing w:after="120" w:line="276"/>
       </w:pPr>
       <w:r>
-        <w:t xml:space="preserve">El profesor guía revisó la versión 2 del informe de la Fase 1 (revisión técnica del 24-10-2026). Varias de sus observaciones piden una medición o una decisión que esta fase ya hizo con la base completa. Esas observaciones no se corrigen en el informe de la Fase 1: se responden aquí, con la evidencia. Las demás se aplicaron en el informe de la Fase 1 (versión 6, Anexo B).</w:t>
+        <w:t xml:space="preserve">El profesor guía revisó la versión 2 del informe de la Fase 1 (revisión técnica del 24-10-2026). Varias de sus observaciones piden una medición o una decisión que esta fase ya hizo con la base completa. Esas observaciones no se corrigen en el informe de la Fase 1: se responden aquí, con la evidencia. Las demás se aplicaron en el informe de la Fase 1 (versión 6).</w:t>
       </w:r>
     </w:p>
     <w:tbl>
@@ -8252,7 +8252,7 @@
         <w:t xml:space="preserve">Lo que esta fase no resuelve.</w:t>
       </w:r>
       <w:r>
-        <w:t xml:space="preserve"> Tres comentarios no dependen de los datos y siguen como decisiones del autor en el informe de la Fase 1: los nombres de los hospitales (decisión 10, ya resuelta con solo códigos), el aviso a FONASA de los valores con forma de RUT (decisión 11) y la validación clínica (decisión 12).</w:t>
+        <w:t xml:space="preserve"> Dos comentarios no dependen de los datos y siguen en el informe de la Fase 1: los nombres de los hospitales (decisión 10, ya resuelta con solo códigos) y la validación clínica (decisión 12).</w:t>
       </w:r>
     </w:p>
     <w:sectPr>

</xml_diff>